<commit_message>
Updated IAC to be ITAC on all report templates
</commit_message>
<xml_diff>
--- a/Report/BestPractice.docx
+++ b/Report/BestPractice.docx
@@ -1,6 +1,6 @@
 
 <file path=word/document.xml><?xml version="1.0" encoding="utf-8"?>
-<w:document xmlns:wpc="http://schemas.microsoft.com/office/word/2010/wordprocessingCanvas" xmlns:cx="http://schemas.microsoft.com/office/drawing/2014/chartex" xmlns:cx1="http://schemas.microsoft.com/office/drawing/2015/9/8/chartex" xmlns:cx2="http://schemas.microsoft.com/office/drawing/2015/10/21/chartex" xmlns:cx3="http://schemas.microsoft.com/office/drawing/2016/5/9/chartex" xmlns:cx4="http://schemas.microsoft.com/office/drawing/2016/5/10/chartex" xmlns:cx5="http://schemas.microsoft.com/office/drawing/2016/5/11/chartex" xmlns:cx6="http://schemas.microsoft.com/office/drawing/2016/5/12/chartex" xmlns:cx7="http://schemas.microsoft.com/office/drawing/2016/5/13/chartex" xmlns:cx8="http://schemas.microsoft.com/office/drawing/2016/5/14/chartex" xmlns:mc="http://schemas.openxmlformats.org/markup-compatibility/2006" xmlns:aink="http://schemas.microsoft.com/office/drawing/2016/ink" xmlns:am3d="http://schemas.microsoft.com/office/drawing/2017/model3d" xmlns:o="urn:schemas-microsoft-com:office:office" xmlns:oel="http://schemas.microsoft.com/office/2019/extlst" xmlns:r="http://schemas.openxmlformats.org/officeDocument/2006/relationships" xmlns:m="http://schemas.openxmlformats.org/officeDocument/2006/math" xmlns:v="urn:schemas-microsoft-com:vml" xmlns:wp14="http://schemas.microsoft.com/office/word/2010/wordprocessingDrawing" xmlns:wp="http://schemas.openxmlformats.org/drawingml/2006/wordprocessingDrawing" xmlns:w10="urn:schemas-microsoft-com:office:word" xmlns:w="http://schemas.openxmlformats.org/wordprocessingml/2006/main" xmlns:w14="http://schemas.microsoft.com/office/word/2010/wordml" xmlns:w15="http://schemas.microsoft.com/office/word/2012/wordml" xmlns:w16cex="http://schemas.microsoft.com/office/word/2018/wordml/cex" xmlns:w16cid="http://schemas.microsoft.com/office/word/2016/wordml/cid" xmlns:w16="http://schemas.microsoft.com/office/word/2018/wordml" xmlns:w16sdtdh="http://schemas.microsoft.com/office/word/2020/wordml/sdtdatahash" xmlns:w16se="http://schemas.microsoft.com/office/word/2015/wordml/symex" xmlns:wpg="http://schemas.microsoft.com/office/word/2010/wordprocessingGroup" xmlns:wpi="http://schemas.microsoft.com/office/word/2010/wordprocessingInk" xmlns:wne="http://schemas.microsoft.com/office/word/2006/wordml" xmlns:wps="http://schemas.microsoft.com/office/word/2010/wordprocessingShape" mc:Ignorable="w14 w15 w16se w16cid w16 w16cex w16sdtdh wp14">
+<w:document xmlns:wpc="http://schemas.microsoft.com/office/word/2010/wordprocessingCanvas" xmlns:cx="http://schemas.microsoft.com/office/drawing/2014/chartex" xmlns:cx1="http://schemas.microsoft.com/office/drawing/2015/9/8/chartex" xmlns:cx2="http://schemas.microsoft.com/office/drawing/2015/10/21/chartex" xmlns:cx3="http://schemas.microsoft.com/office/drawing/2016/5/9/chartex" xmlns:cx4="http://schemas.microsoft.com/office/drawing/2016/5/10/chartex" xmlns:cx5="http://schemas.microsoft.com/office/drawing/2016/5/11/chartex" xmlns:cx6="http://schemas.microsoft.com/office/drawing/2016/5/12/chartex" xmlns:cx7="http://schemas.microsoft.com/office/drawing/2016/5/13/chartex" xmlns:cx8="http://schemas.microsoft.com/office/drawing/2016/5/14/chartex" xmlns:mc="http://schemas.openxmlformats.org/markup-compatibility/2006" xmlns:aink="http://schemas.microsoft.com/office/drawing/2016/ink" xmlns:am3d="http://schemas.microsoft.com/office/drawing/2017/model3d" xmlns:o="urn:schemas-microsoft-com:office:office" xmlns:oel="http://schemas.microsoft.com/office/2019/extlst" xmlns:r="http://schemas.openxmlformats.org/officeDocument/2006/relationships" xmlns:m="http://schemas.openxmlformats.org/officeDocument/2006/math" xmlns:v="urn:schemas-microsoft-com:vml" xmlns:wp14="http://schemas.microsoft.com/office/word/2010/wordprocessingDrawing" xmlns:wp="http://schemas.openxmlformats.org/drawingml/2006/wordprocessingDrawing" xmlns:w10="urn:schemas-microsoft-com:office:word" xmlns:w="http://schemas.openxmlformats.org/wordprocessingml/2006/main" xmlns:w14="http://schemas.microsoft.com/office/word/2010/wordml" xmlns:w15="http://schemas.microsoft.com/office/word/2012/wordml" xmlns:w16cex="http://schemas.microsoft.com/office/word/2018/wordml/cex" xmlns:w16cid="http://schemas.microsoft.com/office/word/2016/wordml/cid" xmlns:w16="http://schemas.microsoft.com/office/word/2018/wordml" xmlns:w16du="http://schemas.microsoft.com/office/word/2023/wordml/word16du" xmlns:w16sdtdh="http://schemas.microsoft.com/office/word/2020/wordml/sdtdatahash" xmlns:w16sdtfl="http://schemas.microsoft.com/office/word/2024/wordml/sdtformatlock" xmlns:w16se="http://schemas.microsoft.com/office/word/2015/wordml/symex" xmlns:wpg="http://schemas.microsoft.com/office/word/2010/wordprocessingGroup" xmlns:wpi="http://schemas.microsoft.com/office/word/2010/wordprocessingInk" xmlns:wne="http://schemas.microsoft.com/office/word/2006/wordml" xmlns:wps="http://schemas.microsoft.com/office/word/2010/wordprocessingShape" mc:Ignorable="w14 w15 w16se w16cid w16 w16cex w16sdtdh w16sdtfl w16du wp14">
   <w:body>
     <w:p>
       <w:pPr>
@@ -71,7 +71,15 @@
       </w:pPr>
       <w:r>
         <w:tab/>
-        <w:t xml:space="preserve">The Office of Manufacturing and Energy Supply Chains (MESC) in the U.S. Department of Energy (DOE) has developed a range of tools and guidelines that are of prime interest to industry. The "Best Practices" program includes a set of tools dealing with various aspects of industry, such as steam and its use, pump systems, selection of motors, etc. The program identifies opportunities to save energy and increase efficiency, with the use of new technologies and system improvements to carry out those opportunities.  There are five main areas on which the Best Practices program focuses. These are some of the more energy consuming aspects of industry </w:t>
+        <w:t xml:space="preserve">The Office of Manufacturing and Energy Supply Chains (MESC) in the U.S. Department of Energy (DOE) has developed a range of tools and guidelines that are of prime interest to industry. The "Best Practices" program includes a set of tools dealing with various aspects of industry, such as steam and its use, pump systems, selection of motors, etc. The program identifies opportunities to save energy and increase efficiency, with the use of new technologies and system improvements to carry out those opportunities.  There are five main areas on which the Best Practices program focuses. These are some of the more </w:t>
+      </w:r>
+      <w:proofErr w:type="gramStart"/>
+      <w:r>
+        <w:t>energy consuming</w:t>
+      </w:r>
+      <w:proofErr w:type="gramEnd"/>
+      <w:r>
+        <w:t xml:space="preserve"> aspects of industry </w:t>
       </w:r>
       <w:proofErr w:type="gramStart"/>
       <w:r>
@@ -348,15 +356,7 @@
       </w:pPr>
       <w:r>
         <w:tab/>
-        <w:t xml:space="preserve">As steam is transferred throughout the system, it can lose some of its enthalpy.  Insulating all pipes, </w:t>
-      </w:r>
-      <w:proofErr w:type="gramStart"/>
-      <w:r>
-        <w:t>flanges</w:t>
-      </w:r>
-      <w:proofErr w:type="gramEnd"/>
-      <w:r>
-        <w:t xml:space="preserve"> and valves, as well as having the correct sizes and shapes of all distribution steam traps, is essential for good efficiency.  The boiler pressure must be </w:t>
+        <w:t xml:space="preserve">As steam is transferred throughout the system, it can lose some of its enthalpy.  Insulating all pipes, flanges and valves, as well as having the correct sizes and shapes of all distribution steam traps, is essential for good efficiency.  The boiler pressure must be </w:t>
       </w:r>
       <w:r>
         <w:lastRenderedPageBreak/>
@@ -401,7 +401,35 @@
           <w:color w:val="000000"/>
         </w:rPr>
         <w:tab/>
-        <w:t>When the steam is transported to where it is needed, the equipment using the steam should be used to maximize the effective use and heat of the steam.  Items to be checked include proper size, shape, and maintenance of steam traps for their specific use.  Also, blow down of non-</w:t>
+        <w:t xml:space="preserve">When the steam is transported to where it is needed, the equipment using the steam should be used to maximize the effective use and heat of the steam.  Items to be checked include proper size, shape, and maintenance of steam traps for their specific use.  Also, </w:t>
+      </w:r>
+      <w:proofErr w:type="gramStart"/>
+      <w:r>
+        <w:rPr>
+          <w:color w:val="000000"/>
+        </w:rPr>
+        <w:t>blow</w:t>
+      </w:r>
+      <w:proofErr w:type="gramEnd"/>
+      <w:r>
+        <w:rPr>
+          <w:color w:val="000000"/>
+        </w:rPr>
+        <w:t xml:space="preserve"> </w:t>
+      </w:r>
+      <w:proofErr w:type="gramStart"/>
+      <w:r>
+        <w:rPr>
+          <w:color w:val="000000"/>
+        </w:rPr>
+        <w:t>down of</w:t>
+      </w:r>
+      <w:proofErr w:type="gramEnd"/>
+      <w:r>
+        <w:rPr>
+          <w:color w:val="000000"/>
+        </w:rPr>
+        <w:t xml:space="preserve"> non-</w:t>
       </w:r>
       <w:proofErr w:type="spellStart"/>
       <w:r>
@@ -526,7 +554,21 @@
         </w:r>
       </w:hyperlink>
       <w:r>
-        <w:t xml:space="preserve">). There are numerous training sessions available year-round and across the country. Many of these training sessions are system-wide and component specific. MESC has trained individuals to become qualified specialists with the assessment tools, and some of them can be reached through the IAC programs, including Lehigh University.  </w:t>
+        <w:t xml:space="preserve">). There are numerous training sessions available year-round and across the country. Many of these training sessions are system-wide and component specific. MESC has trained individuals to become qualified specialists with </w:t>
+      </w:r>
+      <w:proofErr w:type="gramStart"/>
+      <w:r>
+        <w:t>the assessment</w:t>
+      </w:r>
+      <w:proofErr w:type="gramEnd"/>
+      <w:r>
+        <w:t xml:space="preserve"> tools, and some of them can be reached through the I</w:t>
+      </w:r>
+      <w:r>
+        <w:t>T</w:t>
+      </w:r>
+      <w:r>
+        <w:t xml:space="preserve">AC programs, including Lehigh University.  </w:t>
       </w:r>
     </w:p>
     <w:p>
@@ -545,7 +587,13 @@
         </w:sectPr>
       </w:pPr>
       <w:r>
-        <w:t>Additional information is available from IACs, Allied Powers, and NIMAP (National Inventory of Manufacturing Assistance Programs) on the MESC website, as well as listings in many industry publications. Another source for such information is through the MESC Clearinghouse by phone (1-800-862-2086), which can give answers to questions regarding services, publications, and products. A relatively small investment in this area could lead to potentially large savings.</w:t>
+        <w:t>Additional information is available from I</w:t>
+      </w:r>
+      <w:r>
+        <w:t>T</w:t>
+      </w:r>
+      <w:r>
+        <w:t>ACs, Allied Powers, and NIMAP (National Inventory of Manufacturing Assistance Programs) on the MESC website, as well as listings in many industry publications. Another source for such information is through the MESC Clearinghouse by phone (1-800-862-2086), which can give answers to questions regarding services, publications, and products. A relatively small investment in this area could lead to potentially large savings.</w:t>
       </w:r>
     </w:p>
     <w:p>
@@ -1553,21 +1601,21 @@
         <w:rPr>
           <w:color w:val="000000"/>
         </w:rPr>
-        <w:t xml:space="preserve"> understand the types and sources of all waste streams. Accounting for exact quantities and costs is important to this process. When this has been done, it is necessary to analyze this information from economic, </w:t>
+        <w:t xml:space="preserve"> understand the types and sources of all waste streams. Accounting for exact quantities and costs is important to this process. When this has been done, it is necessary to analyze this information from </w:t>
       </w:r>
       <w:proofErr w:type="gramStart"/>
       <w:r>
         <w:rPr>
           <w:color w:val="000000"/>
         </w:rPr>
-        <w:t>legal</w:t>
+        <w:t>economic</w:t>
       </w:r>
       <w:proofErr w:type="gramEnd"/>
       <w:r>
         <w:rPr>
           <w:color w:val="000000"/>
         </w:rPr>
-        <w:t xml:space="preserve"> and technical perspectives, and, finally, to prepare a comprehensive waste plan that addresses corporate concerns in the most effective way. The Environmental Protection Agency recommends the following four-step process for effective waste management.</w:t>
+        <w:t>, legal and technical perspectives, and, finally, to prepare a comprehensive waste plan that addresses corporate concerns in the most effective way. The Environmental Protection Agency recommends the following four-step process for effective waste management.</w:t>
       </w:r>
     </w:p>
     <w:p>
@@ -1613,16 +1661,8 @@
         <w:rPr>
           <w:color w:val="000000"/>
         </w:rPr>
-        <w:t xml:space="preserve">Establish management </w:t>
-      </w:r>
-      <w:proofErr w:type="gramStart"/>
-      <w:r>
-        <w:rPr>
-          <w:color w:val="000000"/>
-        </w:rPr>
-        <w:t>commitment</w:t>
-      </w:r>
-      <w:proofErr w:type="gramEnd"/>
+        <w:t>Establish management commitment</w:t>
+      </w:r>
     </w:p>
     <w:p>
       <w:pPr>
@@ -1644,16 +1684,8 @@
         <w:rPr>
           <w:color w:val="000000"/>
         </w:rPr>
-        <w:t xml:space="preserve">Set overall assessment program </w:t>
-      </w:r>
-      <w:proofErr w:type="gramStart"/>
-      <w:r>
-        <w:rPr>
-          <w:color w:val="000000"/>
-        </w:rPr>
-        <w:t>goals</w:t>
-      </w:r>
-      <w:proofErr w:type="gramEnd"/>
+        <w:t>Set overall assessment program goals</w:t>
+      </w:r>
     </w:p>
     <w:p>
       <w:pPr>
@@ -1675,16 +1707,8 @@
         <w:rPr>
           <w:color w:val="000000"/>
         </w:rPr>
-        <w:t xml:space="preserve">Organize assessment program </w:t>
-      </w:r>
-      <w:proofErr w:type="gramStart"/>
-      <w:r>
-        <w:rPr>
-          <w:color w:val="000000"/>
-        </w:rPr>
-        <w:t>team</w:t>
-      </w:r>
-      <w:proofErr w:type="gramEnd"/>
+        <w:t>Organize assessment program team</w:t>
+      </w:r>
     </w:p>
     <w:p>
       <w:pPr>
@@ -1729,16 +1753,8 @@
         <w:rPr>
           <w:color w:val="000000"/>
         </w:rPr>
-        <w:t xml:space="preserve">Collect and process plant </w:t>
-      </w:r>
-      <w:proofErr w:type="gramStart"/>
-      <w:r>
-        <w:rPr>
-          <w:color w:val="000000"/>
-        </w:rPr>
-        <w:t>data</w:t>
-      </w:r>
-      <w:proofErr w:type="gramEnd"/>
+        <w:t>Collect and process plant data</w:t>
+      </w:r>
     </w:p>
     <w:p>
       <w:pPr>
@@ -1761,16 +1777,8 @@
           <w:color w:val="000000"/>
         </w:rPr>
         <w:lastRenderedPageBreak/>
-        <w:t xml:space="preserve">Prioritize and select assessment </w:t>
-      </w:r>
-      <w:proofErr w:type="gramStart"/>
-      <w:r>
-        <w:rPr>
-          <w:color w:val="000000"/>
-        </w:rPr>
-        <w:t>goals</w:t>
-      </w:r>
-      <w:proofErr w:type="gramEnd"/>
+        <w:t>Prioritize and select assessment goals</w:t>
+      </w:r>
     </w:p>
     <w:p>
       <w:pPr>
@@ -1792,21 +1800,7 @@
         <w:rPr>
           <w:color w:val="000000"/>
         </w:rPr>
-        <w:t xml:space="preserve">Inspect plant and review plant </w:t>
-      </w:r>
-      <w:proofErr w:type="gramStart"/>
-      <w:r>
-        <w:rPr>
-          <w:color w:val="000000"/>
-        </w:rPr>
-        <w:t>data</w:t>
-      </w:r>
-      <w:proofErr w:type="gramEnd"/>
-      <w:r>
-        <w:rPr>
-          <w:color w:val="000000"/>
-        </w:rPr>
-        <w:t xml:space="preserve"> </w:t>
+        <w:t xml:space="preserve">Inspect plant and review plant data </w:t>
       </w:r>
     </w:p>
     <w:p>
@@ -1829,16 +1823,8 @@
         <w:rPr>
           <w:color w:val="000000"/>
         </w:rPr>
-        <w:t xml:space="preserve">Generate and select options for </w:t>
-      </w:r>
-      <w:proofErr w:type="gramStart"/>
-      <w:r>
-        <w:rPr>
-          <w:color w:val="000000"/>
-        </w:rPr>
-        <w:t>study</w:t>
-      </w:r>
-      <w:proofErr w:type="gramEnd"/>
+        <w:t>Generate and select options for study</w:t>
+      </w:r>
     </w:p>
     <w:p>
       <w:pPr>
@@ -1929,16 +1915,8 @@
         <w:rPr>
           <w:color w:val="000000"/>
         </w:rPr>
-        <w:t xml:space="preserve">Select options for </w:t>
-      </w:r>
-      <w:proofErr w:type="gramStart"/>
-      <w:r>
-        <w:rPr>
-          <w:color w:val="000000"/>
-        </w:rPr>
-        <w:t>implementation</w:t>
-      </w:r>
-      <w:proofErr w:type="gramEnd"/>
+        <w:t>Select options for implementation</w:t>
+      </w:r>
     </w:p>
     <w:p>
       <w:pPr>
@@ -1983,16 +1961,8 @@
         <w:rPr>
           <w:color w:val="000000"/>
         </w:rPr>
-        <w:t xml:space="preserve">Finalize funding for justifiable </w:t>
-      </w:r>
-      <w:proofErr w:type="gramStart"/>
-      <w:r>
-        <w:rPr>
-          <w:color w:val="000000"/>
-        </w:rPr>
-        <w:t>projects</w:t>
-      </w:r>
-      <w:proofErr w:type="gramEnd"/>
+        <w:t>Finalize funding for justifiable projects</w:t>
+      </w:r>
     </w:p>
     <w:p>
       <w:pPr>
@@ -2014,16 +1984,8 @@
         <w:rPr>
           <w:color w:val="000000"/>
         </w:rPr>
-        <w:t xml:space="preserve">Install </w:t>
-      </w:r>
-      <w:proofErr w:type="gramStart"/>
-      <w:r>
-        <w:rPr>
-          <w:color w:val="000000"/>
-        </w:rPr>
-        <w:t>equipment</w:t>
-      </w:r>
-      <w:proofErr w:type="gramEnd"/>
+        <w:t>Install equipment</w:t>
+      </w:r>
     </w:p>
     <w:p>
       <w:pPr>
@@ -2045,16 +2007,8 @@
         <w:rPr>
           <w:color w:val="000000"/>
         </w:rPr>
-        <w:t xml:space="preserve">Implement procedures for </w:t>
-      </w:r>
-      <w:proofErr w:type="gramStart"/>
-      <w:r>
-        <w:rPr>
-          <w:color w:val="000000"/>
-        </w:rPr>
-        <w:t>savings</w:t>
-      </w:r>
-      <w:proofErr w:type="gramEnd"/>
+        <w:t>Implement procedures for savings</w:t>
+      </w:r>
     </w:p>
     <w:p>
       <w:pPr>
@@ -2125,16 +2079,8 @@
         <w:rPr>
           <w:color w:val="000000"/>
         </w:rPr>
-        <w:t xml:space="preserve">Waste </w:t>
-      </w:r>
-      <w:proofErr w:type="gramStart"/>
-      <w:r>
-        <w:rPr>
-          <w:color w:val="000000"/>
-        </w:rPr>
-        <w:t>source</w:t>
-      </w:r>
-      <w:proofErr w:type="gramEnd"/>
+        <w:t>Waste source</w:t>
+      </w:r>
     </w:p>
     <w:p>
       <w:pPr>
@@ -2179,16 +2125,8 @@
         <w:rPr>
           <w:color w:val="000000"/>
         </w:rPr>
-        <w:t xml:space="preserve">Implement procedures for </w:t>
-      </w:r>
-      <w:proofErr w:type="gramStart"/>
-      <w:r>
-        <w:rPr>
-          <w:color w:val="000000"/>
-        </w:rPr>
-        <w:t>savings</w:t>
-      </w:r>
-      <w:proofErr w:type="gramEnd"/>
+        <w:t>Implement procedures for savings</w:t>
+      </w:r>
     </w:p>
     <w:p>
       <w:pPr>
@@ -2256,16 +2194,8 @@
         <w:rPr>
           <w:color w:val="000000"/>
         </w:rPr>
-        <w:t xml:space="preserve">Waste management </w:t>
-      </w:r>
-      <w:proofErr w:type="gramStart"/>
-      <w:r>
-        <w:rPr>
-          <w:color w:val="000000"/>
-        </w:rPr>
-        <w:t>methods</w:t>
-      </w:r>
-      <w:proofErr w:type="gramEnd"/>
+        <w:t>Waste management methods</w:t>
+      </w:r>
     </w:p>
     <w:p>
       <w:pPr>
@@ -2425,21 +2355,7 @@
         <w:rPr>
           <w:color w:val="000000"/>
         </w:rPr>
-        <w:t>.  Note, also, that an AR involving only a reduction in demand (KW</w:t>
-      </w:r>
-      <w:proofErr w:type="gramStart"/>
-      <w:r>
-        <w:rPr>
-          <w:color w:val="000000"/>
-        </w:rPr>
-        <w:t>)</w:t>
-      </w:r>
-      <w:proofErr w:type="gramEnd"/>
-      <w:r>
-        <w:rPr>
-          <w:color w:val="000000"/>
-        </w:rPr>
-        <w:t xml:space="preserve"> or power factor (PF) improvement saves only dollars, not energy consumption (kWh).</w:t>
+        <w:t>.  Note, also, that an AR involving only a reduction in demand (KW) or power factor (PF) improvement saves only dollars, not energy consumption (kWh).</w:t>
       </w:r>
     </w:p>
     <w:p>
@@ -2544,7 +2460,13 @@
         <w:jc w:val="both"/>
       </w:pPr>
       <w:r>
-        <w:t>Industrial Assessment Centers work with manufacturing clients to increase awareness of cybersecurity risks and potential mitigation activities. As part of facility site visits, IAC clients may elect to receive cybersecurity risk assessments to identify security and privacy deficiencies to the business infrastructure, with a focus on vulnerabilities associated with industrial controls systems.</w:t>
+        <w:t>Industrial Assessment Centers work with manufacturing clients to increase awareness of cybersecurity risks and potential mitigation activities. As part of facility site visits, I</w:t>
+      </w:r>
+      <w:r>
+        <w:t>T</w:t>
+      </w:r>
+      <w:r>
+        <w:t>AC clients may elect to receive cybersecurity risk assessments to identify security and privacy deficiencies to the business infrastructure, with a focus on vulnerabilities associated with industrial controls systems.</w:t>
       </w:r>
     </w:p>
     <w:p>
@@ -2554,7 +2476,19 @@
         <w:jc w:val="both"/>
       </w:pPr>
       <w:r>
-        <w:t>The IAC Industrial Control Systems Cybersecurity Assessment Tool includes 20 simple questions to characterize industrial controls systems and plant operations. The tool then provides a high-level assessment of risk (high, medium, or low). The companion User Guide provides additional context for the questions included in the tool, to help clients understand how certain business practices lead to cybersecurity risk. Upon conclusion of the assessment, the tool generates a customized list of action items associated with the risks identified. For additional guidance, IACs refer clients to additional technical resource materials available through the NIST Manufacturing Extension Partnership (MEP) and other organizations.</w:t>
+        <w:t>The I</w:t>
+      </w:r>
+      <w:r>
+        <w:t>T</w:t>
+      </w:r>
+      <w:r>
+        <w:t>AC Industrial Control Systems Cybersecurity Assessment Tool includes 20 simple questions to characterize industrial controls systems and plant operations. The tool then provides a high-level assessment of risk (high, medium, or low). The companion User Guide provides additional context for the questions included in the tool, to help clients understand how certain business practices lead to cybersecurity risk. Upon conclusion of the assessment, the tool generates a customized list of action items associated with the risks identified. For additional guidance, I</w:t>
+      </w:r>
+      <w:r>
+        <w:t>T</w:t>
+      </w:r>
+      <w:r>
+        <w:t>ACs refer clients to additional technical resource materials available through the NIST Manufacturing Extension Partnership (MEP) and other organizations.</w:t>
       </w:r>
     </w:p>
     <w:p>
@@ -2671,16 +2605,8 @@
         <w:rPr>
           <w:color w:val="000000"/>
         </w:rPr>
-        <w:t xml:space="preserve">Identify what information your business stores and </w:t>
-      </w:r>
-      <w:proofErr w:type="gramStart"/>
-      <w:r>
-        <w:rPr>
-          <w:color w:val="000000"/>
-        </w:rPr>
-        <w:t>uses</w:t>
-      </w:r>
-      <w:proofErr w:type="gramEnd"/>
+        <w:t>Identify what information your business stores and uses</w:t>
+      </w:r>
     </w:p>
     <w:p>
       <w:pPr>
@@ -2705,16 +2631,8 @@
         <w:rPr>
           <w:color w:val="000000"/>
         </w:rPr>
-        <w:t xml:space="preserve">Determine the value of your </w:t>
-      </w:r>
-      <w:proofErr w:type="gramStart"/>
-      <w:r>
-        <w:rPr>
-          <w:color w:val="000000"/>
-        </w:rPr>
-        <w:t>information</w:t>
-      </w:r>
-      <w:proofErr w:type="gramEnd"/>
+        <w:t>Determine the value of your information</w:t>
+      </w:r>
     </w:p>
     <w:p>
       <w:pPr>
@@ -2739,16 +2657,8 @@
         <w:rPr>
           <w:color w:val="000000"/>
         </w:rPr>
-        <w:t xml:space="preserve">Develop an inventory of technologies used to store and process </w:t>
-      </w:r>
-      <w:proofErr w:type="gramStart"/>
-      <w:r>
-        <w:rPr>
-          <w:color w:val="000000"/>
-        </w:rPr>
-        <w:t>information</w:t>
-      </w:r>
-      <w:proofErr w:type="gramEnd"/>
+        <w:t>Develop an inventory of technologies used to store and process information</w:t>
+      </w:r>
     </w:p>
     <w:p>
       <w:pPr>
@@ -2773,16 +2683,8 @@
         <w:rPr>
           <w:color w:val="000000"/>
         </w:rPr>
-        <w:t xml:space="preserve">Understand your threats and </w:t>
-      </w:r>
-      <w:proofErr w:type="gramStart"/>
-      <w:r>
-        <w:rPr>
-          <w:color w:val="000000"/>
-        </w:rPr>
-        <w:t>vulnerabilities</w:t>
-      </w:r>
-      <w:proofErr w:type="gramEnd"/>
+        <w:t>Understand your threats and vulnerabilities</w:t>
+      </w:r>
     </w:p>
     <w:p>
       <w:pPr>
@@ -2833,16 +2735,8 @@
         <w:rPr>
           <w:color w:val="000000"/>
         </w:rPr>
-        <w:t xml:space="preserve">Identify and control who has access to your business </w:t>
-      </w:r>
-      <w:proofErr w:type="gramStart"/>
-      <w:r>
-        <w:rPr>
-          <w:color w:val="000000"/>
-        </w:rPr>
-        <w:t>information</w:t>
-      </w:r>
-      <w:proofErr w:type="gramEnd"/>
+        <w:t>Identify and control who has access to your business information</w:t>
+      </w:r>
     </w:p>
     <w:p>
       <w:pPr>
@@ -2867,16 +2761,8 @@
         <w:rPr>
           <w:color w:val="000000"/>
         </w:rPr>
-        <w:t xml:space="preserve">Conduct background </w:t>
-      </w:r>
-      <w:proofErr w:type="gramStart"/>
-      <w:r>
-        <w:rPr>
-          <w:color w:val="000000"/>
-        </w:rPr>
-        <w:t>checks</w:t>
-      </w:r>
-      <w:proofErr w:type="gramEnd"/>
+        <w:t>Conduct background checks</w:t>
+      </w:r>
     </w:p>
     <w:p>
       <w:pPr>
@@ -2901,16 +2787,8 @@
         <w:rPr>
           <w:color w:val="000000"/>
         </w:rPr>
-        <w:t xml:space="preserve">Require individual user accounts for each </w:t>
-      </w:r>
-      <w:proofErr w:type="gramStart"/>
-      <w:r>
-        <w:rPr>
-          <w:color w:val="000000"/>
-        </w:rPr>
-        <w:t>employee</w:t>
-      </w:r>
-      <w:proofErr w:type="gramEnd"/>
+        <w:t>Require individual user accounts for each employee</w:t>
+      </w:r>
     </w:p>
     <w:p>
       <w:pPr>
@@ -2935,16 +2813,8 @@
         <w:rPr>
           <w:color w:val="000000"/>
         </w:rPr>
-        <w:t xml:space="preserve">Create policies and procedures for information </w:t>
-      </w:r>
-      <w:proofErr w:type="gramStart"/>
-      <w:r>
-        <w:rPr>
-          <w:color w:val="000000"/>
-        </w:rPr>
-        <w:t>security</w:t>
-      </w:r>
-      <w:proofErr w:type="gramEnd"/>
+        <w:t>Create policies and procedures for information security</w:t>
+      </w:r>
     </w:p>
     <w:p>
       <w:pPr>
@@ -2984,16 +2854,8 @@
         <w:rPr>
           <w:color w:val="000000"/>
         </w:rPr>
-        <w:t xml:space="preserve">Limit employee access to data and </w:t>
-      </w:r>
-      <w:proofErr w:type="gramStart"/>
-      <w:r>
-        <w:rPr>
-          <w:color w:val="000000"/>
-        </w:rPr>
-        <w:t>information</w:t>
-      </w:r>
-      <w:proofErr w:type="gramEnd"/>
+        <w:t>Limit employee access to data and information</w:t>
+      </w:r>
     </w:p>
     <w:p>
       <w:pPr>
@@ -3044,16 +2906,8 @@
         <w:rPr>
           <w:color w:val="000000"/>
         </w:rPr>
-        <w:t xml:space="preserve">Patch your operating systems and </w:t>
-      </w:r>
-      <w:proofErr w:type="gramStart"/>
-      <w:r>
-        <w:rPr>
-          <w:color w:val="000000"/>
-        </w:rPr>
-        <w:t>applications</w:t>
-      </w:r>
-      <w:proofErr w:type="gramEnd"/>
+        <w:t>Patch your operating systems and applications</w:t>
+      </w:r>
     </w:p>
     <w:p>
       <w:pPr>
@@ -3078,16 +2932,8 @@
         <w:rPr>
           <w:color w:val="000000"/>
         </w:rPr>
-        <w:t xml:space="preserve">Install and activate software and hardware firewalls on all your business </w:t>
-      </w:r>
-      <w:proofErr w:type="gramStart"/>
-      <w:r>
-        <w:rPr>
-          <w:color w:val="000000"/>
-        </w:rPr>
-        <w:t>networks</w:t>
-      </w:r>
-      <w:proofErr w:type="gramEnd"/>
+        <w:t>Install and activate software and hardware firewalls on all your business networks</w:t>
+      </w:r>
     </w:p>
     <w:p>
       <w:pPr>
@@ -3112,16 +2958,8 @@
         <w:rPr>
           <w:color w:val="000000"/>
         </w:rPr>
-        <w:t xml:space="preserve">Secure your wireless access point and </w:t>
-      </w:r>
-      <w:proofErr w:type="gramStart"/>
-      <w:r>
-        <w:rPr>
-          <w:color w:val="000000"/>
-        </w:rPr>
-        <w:t>networks</w:t>
-      </w:r>
-      <w:proofErr w:type="gramEnd"/>
+        <w:t>Secure your wireless access point and networks</w:t>
+      </w:r>
     </w:p>
     <w:p>
       <w:pPr>
@@ -3146,16 +2984,8 @@
         <w:rPr>
           <w:color w:val="000000"/>
         </w:rPr>
-        <w:t xml:space="preserve">Set up web and email </w:t>
-      </w:r>
-      <w:proofErr w:type="gramStart"/>
-      <w:r>
-        <w:rPr>
-          <w:color w:val="000000"/>
-        </w:rPr>
-        <w:t>filters</w:t>
-      </w:r>
-      <w:proofErr w:type="gramEnd"/>
+        <w:t>Set up web and email filters</w:t>
+      </w:r>
     </w:p>
     <w:p>
       <w:pPr>
@@ -3180,16 +3010,8 @@
         <w:rPr>
           <w:color w:val="000000"/>
         </w:rPr>
-        <w:t xml:space="preserve">Use encryption for sensitive business </w:t>
-      </w:r>
-      <w:proofErr w:type="gramStart"/>
-      <w:r>
-        <w:rPr>
-          <w:color w:val="000000"/>
-        </w:rPr>
-        <w:t>information</w:t>
-      </w:r>
-      <w:proofErr w:type="gramEnd"/>
+        <w:t>Use encryption for sensitive business information</w:t>
+      </w:r>
     </w:p>
     <w:p>
       <w:pPr>
@@ -3281,16 +3103,8 @@
         <w:rPr>
           <w:color w:val="000000"/>
         </w:rPr>
-        <w:t xml:space="preserve">Install and update anti-virus, -spyware, and other –malware </w:t>
-      </w:r>
-      <w:proofErr w:type="gramStart"/>
-      <w:r>
-        <w:rPr>
-          <w:color w:val="000000"/>
-        </w:rPr>
-        <w:t>programs</w:t>
-      </w:r>
-      <w:proofErr w:type="gramEnd"/>
+        <w:t>Install and update anti-virus, -spyware, and other –malware programs</w:t>
+      </w:r>
     </w:p>
     <w:p>
       <w:pPr>
@@ -3315,16 +3129,8 @@
         <w:rPr>
           <w:color w:val="000000"/>
         </w:rPr>
-        <w:t xml:space="preserve">Maintain and monitor </w:t>
-      </w:r>
-      <w:proofErr w:type="gramStart"/>
-      <w:r>
-        <w:rPr>
-          <w:color w:val="000000"/>
-        </w:rPr>
-        <w:t>logs</w:t>
-      </w:r>
-      <w:proofErr w:type="gramEnd"/>
+        <w:t>Maintain and monitor logs</w:t>
+      </w:r>
     </w:p>
     <w:p>
       <w:pPr>
@@ -3364,16 +3170,8 @@
         <w:rPr>
           <w:color w:val="000000"/>
         </w:rPr>
-        <w:t xml:space="preserve">Develop a plan for disasters and information security </w:t>
-      </w:r>
-      <w:proofErr w:type="gramStart"/>
-      <w:r>
-        <w:rPr>
-          <w:color w:val="000000"/>
-        </w:rPr>
-        <w:t>incidents</w:t>
-      </w:r>
-      <w:proofErr w:type="gramEnd"/>
+        <w:t>Develop a plan for disasters and information security incidents</w:t>
+      </w:r>
     </w:p>
     <w:p>
       <w:pPr>
@@ -3413,16 +3211,8 @@
         <w:rPr>
           <w:color w:val="000000"/>
         </w:rPr>
-        <w:t>Make full backups of important business data/</w:t>
-      </w:r>
-      <w:proofErr w:type="gramStart"/>
-      <w:r>
-        <w:rPr>
-          <w:color w:val="000000"/>
-        </w:rPr>
-        <w:t>information</w:t>
-      </w:r>
-      <w:proofErr w:type="gramEnd"/>
+        <w:t>Make full backups of important business data/information</w:t>
+      </w:r>
     </w:p>
     <w:p>
       <w:pPr>
@@ -3447,16 +3237,8 @@
         <w:rPr>
           <w:color w:val="000000"/>
         </w:rPr>
-        <w:t>Make incremental backups of important business data/</w:t>
-      </w:r>
-      <w:proofErr w:type="gramStart"/>
-      <w:r>
-        <w:rPr>
-          <w:color w:val="000000"/>
-        </w:rPr>
-        <w:t>information</w:t>
-      </w:r>
-      <w:proofErr w:type="gramEnd"/>
+        <w:t>Make incremental backups of important business data/information</w:t>
+      </w:r>
     </w:p>
     <w:p>
       <w:pPr>
@@ -3481,16 +3263,8 @@
         <w:rPr>
           <w:color w:val="000000"/>
         </w:rPr>
-        <w:t xml:space="preserve">Consider cyber </w:t>
-      </w:r>
-      <w:proofErr w:type="gramStart"/>
-      <w:r>
-        <w:rPr>
-          <w:color w:val="000000"/>
-        </w:rPr>
-        <w:t>insurance</w:t>
-      </w:r>
-      <w:proofErr w:type="gramEnd"/>
+        <w:t>Consider cyber insurance</w:t>
+      </w:r>
     </w:p>
     <w:p>
       <w:pPr>
@@ -4252,7 +4026,7 @@
 </file>
 
 <file path=word/endnotes.xml><?xml version="1.0" encoding="utf-8"?>
-<w:endnotes xmlns:wpc="http://schemas.microsoft.com/office/word/2010/wordprocessingCanvas" xmlns:cx="http://schemas.microsoft.com/office/drawing/2014/chartex" xmlns:cx1="http://schemas.microsoft.com/office/drawing/2015/9/8/chartex" xmlns:cx2="http://schemas.microsoft.com/office/drawing/2015/10/21/chartex" xmlns:cx3="http://schemas.microsoft.com/office/drawing/2016/5/9/chartex" xmlns:cx4="http://schemas.microsoft.com/office/drawing/2016/5/10/chartex" xmlns:cx5="http://schemas.microsoft.com/office/drawing/2016/5/11/chartex" xmlns:cx6="http://schemas.microsoft.com/office/drawing/2016/5/12/chartex" xmlns:cx7="http://schemas.microsoft.com/office/drawing/2016/5/13/chartex" xmlns:cx8="http://schemas.microsoft.com/office/drawing/2016/5/14/chartex" xmlns:mc="http://schemas.openxmlformats.org/markup-compatibility/2006" xmlns:aink="http://schemas.microsoft.com/office/drawing/2016/ink" xmlns:am3d="http://schemas.microsoft.com/office/drawing/2017/model3d" xmlns:o="urn:schemas-microsoft-com:office:office" xmlns:oel="http://schemas.microsoft.com/office/2019/extlst" xmlns:r="http://schemas.openxmlformats.org/officeDocument/2006/relationships" xmlns:m="http://schemas.openxmlformats.org/officeDocument/2006/math" xmlns:v="urn:schemas-microsoft-com:vml" xmlns:wp14="http://schemas.microsoft.com/office/word/2010/wordprocessingDrawing" xmlns:wp="http://schemas.openxmlformats.org/drawingml/2006/wordprocessingDrawing" xmlns:w10="urn:schemas-microsoft-com:office:word" xmlns:w="http://schemas.openxmlformats.org/wordprocessingml/2006/main" xmlns:w14="http://schemas.microsoft.com/office/word/2010/wordml" xmlns:w15="http://schemas.microsoft.com/office/word/2012/wordml" xmlns:w16cex="http://schemas.microsoft.com/office/word/2018/wordml/cex" xmlns:w16cid="http://schemas.microsoft.com/office/word/2016/wordml/cid" xmlns:w16="http://schemas.microsoft.com/office/word/2018/wordml" xmlns:w16sdtdh="http://schemas.microsoft.com/office/word/2020/wordml/sdtdatahash" xmlns:w16se="http://schemas.microsoft.com/office/word/2015/wordml/symex" xmlns:wpg="http://schemas.microsoft.com/office/word/2010/wordprocessingGroup" xmlns:wpi="http://schemas.microsoft.com/office/word/2010/wordprocessingInk" xmlns:wne="http://schemas.microsoft.com/office/word/2006/wordml" xmlns:wps="http://schemas.microsoft.com/office/word/2010/wordprocessingShape" mc:Ignorable="w14 w15 w16se w16cid w16 w16cex w16sdtdh wp14">
+<w:endnotes xmlns:wpc="http://schemas.microsoft.com/office/word/2010/wordprocessingCanvas" xmlns:cx="http://schemas.microsoft.com/office/drawing/2014/chartex" xmlns:cx1="http://schemas.microsoft.com/office/drawing/2015/9/8/chartex" xmlns:cx2="http://schemas.microsoft.com/office/drawing/2015/10/21/chartex" xmlns:cx3="http://schemas.microsoft.com/office/drawing/2016/5/9/chartex" xmlns:cx4="http://schemas.microsoft.com/office/drawing/2016/5/10/chartex" xmlns:cx5="http://schemas.microsoft.com/office/drawing/2016/5/11/chartex" xmlns:cx6="http://schemas.microsoft.com/office/drawing/2016/5/12/chartex" xmlns:cx7="http://schemas.microsoft.com/office/drawing/2016/5/13/chartex" xmlns:cx8="http://schemas.microsoft.com/office/drawing/2016/5/14/chartex" xmlns:mc="http://schemas.openxmlformats.org/markup-compatibility/2006" xmlns:aink="http://schemas.microsoft.com/office/drawing/2016/ink" xmlns:am3d="http://schemas.microsoft.com/office/drawing/2017/model3d" xmlns:o="urn:schemas-microsoft-com:office:office" xmlns:oel="http://schemas.microsoft.com/office/2019/extlst" xmlns:r="http://schemas.openxmlformats.org/officeDocument/2006/relationships" xmlns:m="http://schemas.openxmlformats.org/officeDocument/2006/math" xmlns:v="urn:schemas-microsoft-com:vml" xmlns:wp14="http://schemas.microsoft.com/office/word/2010/wordprocessingDrawing" xmlns:wp="http://schemas.openxmlformats.org/drawingml/2006/wordprocessingDrawing" xmlns:w10="urn:schemas-microsoft-com:office:word" xmlns:w="http://schemas.openxmlformats.org/wordprocessingml/2006/main" xmlns:w14="http://schemas.microsoft.com/office/word/2010/wordml" xmlns:w15="http://schemas.microsoft.com/office/word/2012/wordml" xmlns:w16cex="http://schemas.microsoft.com/office/word/2018/wordml/cex" xmlns:w16cid="http://schemas.microsoft.com/office/word/2016/wordml/cid" xmlns:w16="http://schemas.microsoft.com/office/word/2018/wordml" xmlns:w16du="http://schemas.microsoft.com/office/word/2023/wordml/word16du" xmlns:w16sdtdh="http://schemas.microsoft.com/office/word/2020/wordml/sdtdatahash" xmlns:w16sdtfl="http://schemas.microsoft.com/office/word/2024/wordml/sdtformatlock" xmlns:w16se="http://schemas.microsoft.com/office/word/2015/wordml/symex" xmlns:wpg="http://schemas.microsoft.com/office/word/2010/wordprocessingGroup" xmlns:wpi="http://schemas.microsoft.com/office/word/2010/wordprocessingInk" xmlns:wne="http://schemas.microsoft.com/office/word/2006/wordml" xmlns:wps="http://schemas.microsoft.com/office/word/2010/wordprocessingShape" mc:Ignorable="w14 w15 w16se w16cid w16 w16cex w16sdtdh w16sdtfl w16du wp14">
   <w:endnote w:type="separator" w:id="-1">
     <w:p>
       <w:r>
@@ -4271,7 +4045,7 @@
 </file>
 
 <file path=word/footer1.xml><?xml version="1.0" encoding="utf-8"?>
-<w:ftr xmlns:wpc="http://schemas.microsoft.com/office/word/2010/wordprocessingCanvas" xmlns:cx="http://schemas.microsoft.com/office/drawing/2014/chartex" xmlns:cx1="http://schemas.microsoft.com/office/drawing/2015/9/8/chartex" xmlns:cx2="http://schemas.microsoft.com/office/drawing/2015/10/21/chartex" xmlns:cx3="http://schemas.microsoft.com/office/drawing/2016/5/9/chartex" xmlns:cx4="http://schemas.microsoft.com/office/drawing/2016/5/10/chartex" xmlns:cx5="http://schemas.microsoft.com/office/drawing/2016/5/11/chartex" xmlns:cx6="http://schemas.microsoft.com/office/drawing/2016/5/12/chartex" xmlns:cx7="http://schemas.microsoft.com/office/drawing/2016/5/13/chartex" xmlns:cx8="http://schemas.microsoft.com/office/drawing/2016/5/14/chartex" xmlns:mc="http://schemas.openxmlformats.org/markup-compatibility/2006" xmlns:aink="http://schemas.microsoft.com/office/drawing/2016/ink" xmlns:am3d="http://schemas.microsoft.com/office/drawing/2017/model3d" xmlns:o="urn:schemas-microsoft-com:office:office" xmlns:oel="http://schemas.microsoft.com/office/2019/extlst" xmlns:r="http://schemas.openxmlformats.org/officeDocument/2006/relationships" xmlns:m="http://schemas.openxmlformats.org/officeDocument/2006/math" xmlns:v="urn:schemas-microsoft-com:vml" xmlns:wp14="http://schemas.microsoft.com/office/word/2010/wordprocessingDrawing" xmlns:wp="http://schemas.openxmlformats.org/drawingml/2006/wordprocessingDrawing" xmlns:w10="urn:schemas-microsoft-com:office:word" xmlns:w="http://schemas.openxmlformats.org/wordprocessingml/2006/main" xmlns:w14="http://schemas.microsoft.com/office/word/2010/wordml" xmlns:w15="http://schemas.microsoft.com/office/word/2012/wordml" xmlns:w16cex="http://schemas.microsoft.com/office/word/2018/wordml/cex" xmlns:w16cid="http://schemas.microsoft.com/office/word/2016/wordml/cid" xmlns:w16="http://schemas.microsoft.com/office/word/2018/wordml" xmlns:w16sdtdh="http://schemas.microsoft.com/office/word/2020/wordml/sdtdatahash" xmlns:w16se="http://schemas.microsoft.com/office/word/2015/wordml/symex" xmlns:wpg="http://schemas.microsoft.com/office/word/2010/wordprocessingGroup" xmlns:wpi="http://schemas.microsoft.com/office/word/2010/wordprocessingInk" xmlns:wne="http://schemas.microsoft.com/office/word/2006/wordml" xmlns:wps="http://schemas.microsoft.com/office/word/2010/wordprocessingShape" mc:Ignorable="w14 w15 w16se w16cid w16 w16cex w16sdtdh wp14">
+<w:ftr xmlns:wpc="http://schemas.microsoft.com/office/word/2010/wordprocessingCanvas" xmlns:cx="http://schemas.microsoft.com/office/drawing/2014/chartex" xmlns:cx1="http://schemas.microsoft.com/office/drawing/2015/9/8/chartex" xmlns:cx2="http://schemas.microsoft.com/office/drawing/2015/10/21/chartex" xmlns:cx3="http://schemas.microsoft.com/office/drawing/2016/5/9/chartex" xmlns:cx4="http://schemas.microsoft.com/office/drawing/2016/5/10/chartex" xmlns:cx5="http://schemas.microsoft.com/office/drawing/2016/5/11/chartex" xmlns:cx6="http://schemas.microsoft.com/office/drawing/2016/5/12/chartex" xmlns:cx7="http://schemas.microsoft.com/office/drawing/2016/5/13/chartex" xmlns:cx8="http://schemas.microsoft.com/office/drawing/2016/5/14/chartex" xmlns:mc="http://schemas.openxmlformats.org/markup-compatibility/2006" xmlns:aink="http://schemas.microsoft.com/office/drawing/2016/ink" xmlns:am3d="http://schemas.microsoft.com/office/drawing/2017/model3d" xmlns:o="urn:schemas-microsoft-com:office:office" xmlns:oel="http://schemas.microsoft.com/office/2019/extlst" xmlns:r="http://schemas.openxmlformats.org/officeDocument/2006/relationships" xmlns:m="http://schemas.openxmlformats.org/officeDocument/2006/math" xmlns:v="urn:schemas-microsoft-com:vml" xmlns:wp14="http://schemas.microsoft.com/office/word/2010/wordprocessingDrawing" xmlns:wp="http://schemas.openxmlformats.org/drawingml/2006/wordprocessingDrawing" xmlns:w10="urn:schemas-microsoft-com:office:word" xmlns:w="http://schemas.openxmlformats.org/wordprocessingml/2006/main" xmlns:w14="http://schemas.microsoft.com/office/word/2010/wordml" xmlns:w15="http://schemas.microsoft.com/office/word/2012/wordml" xmlns:w16cex="http://schemas.microsoft.com/office/word/2018/wordml/cex" xmlns:w16cid="http://schemas.microsoft.com/office/word/2016/wordml/cid" xmlns:w16="http://schemas.microsoft.com/office/word/2018/wordml" xmlns:w16du="http://schemas.microsoft.com/office/word/2023/wordml/word16du" xmlns:w16sdtdh="http://schemas.microsoft.com/office/word/2020/wordml/sdtdatahash" xmlns:w16sdtfl="http://schemas.microsoft.com/office/word/2024/wordml/sdtformatlock" xmlns:w16se="http://schemas.microsoft.com/office/word/2015/wordml/symex" xmlns:wpg="http://schemas.microsoft.com/office/word/2010/wordprocessingGroup" xmlns:wpi="http://schemas.microsoft.com/office/word/2010/wordprocessingInk" xmlns:wne="http://schemas.microsoft.com/office/word/2006/wordml" xmlns:wps="http://schemas.microsoft.com/office/word/2010/wordprocessingShape" mc:Ignorable="w14 w15 w16se w16cid w16 w16cex w16sdtdh w16sdtfl w16du wp14">
   <w:p>
     <w:pPr>
       <w:pBdr>
@@ -4377,7 +4151,7 @@
 </file>
 
 <file path=word/footer2.xml><?xml version="1.0" encoding="utf-8"?>
-<w:ftr xmlns:wpc="http://schemas.microsoft.com/office/word/2010/wordprocessingCanvas" xmlns:cx="http://schemas.microsoft.com/office/drawing/2014/chartex" xmlns:cx1="http://schemas.microsoft.com/office/drawing/2015/9/8/chartex" xmlns:cx2="http://schemas.microsoft.com/office/drawing/2015/10/21/chartex" xmlns:cx3="http://schemas.microsoft.com/office/drawing/2016/5/9/chartex" xmlns:cx4="http://schemas.microsoft.com/office/drawing/2016/5/10/chartex" xmlns:cx5="http://schemas.microsoft.com/office/drawing/2016/5/11/chartex" xmlns:cx6="http://schemas.microsoft.com/office/drawing/2016/5/12/chartex" xmlns:cx7="http://schemas.microsoft.com/office/drawing/2016/5/13/chartex" xmlns:cx8="http://schemas.microsoft.com/office/drawing/2016/5/14/chartex" xmlns:mc="http://schemas.openxmlformats.org/markup-compatibility/2006" xmlns:aink="http://schemas.microsoft.com/office/drawing/2016/ink" xmlns:am3d="http://schemas.microsoft.com/office/drawing/2017/model3d" xmlns:o="urn:schemas-microsoft-com:office:office" xmlns:oel="http://schemas.microsoft.com/office/2019/extlst" xmlns:r="http://schemas.openxmlformats.org/officeDocument/2006/relationships" xmlns:m="http://schemas.openxmlformats.org/officeDocument/2006/math" xmlns:v="urn:schemas-microsoft-com:vml" xmlns:wp14="http://schemas.microsoft.com/office/word/2010/wordprocessingDrawing" xmlns:wp="http://schemas.openxmlformats.org/drawingml/2006/wordprocessingDrawing" xmlns:w10="urn:schemas-microsoft-com:office:word" xmlns:w="http://schemas.openxmlformats.org/wordprocessingml/2006/main" xmlns:w14="http://schemas.microsoft.com/office/word/2010/wordml" xmlns:w15="http://schemas.microsoft.com/office/word/2012/wordml" xmlns:w16cex="http://schemas.microsoft.com/office/word/2018/wordml/cex" xmlns:w16cid="http://schemas.microsoft.com/office/word/2016/wordml/cid" xmlns:w16="http://schemas.microsoft.com/office/word/2018/wordml" xmlns:w16sdtdh="http://schemas.microsoft.com/office/word/2020/wordml/sdtdatahash" xmlns:w16se="http://schemas.microsoft.com/office/word/2015/wordml/symex" xmlns:wpg="http://schemas.microsoft.com/office/word/2010/wordprocessingGroup" xmlns:wpi="http://schemas.microsoft.com/office/word/2010/wordprocessingInk" xmlns:wne="http://schemas.microsoft.com/office/word/2006/wordml" xmlns:wps="http://schemas.microsoft.com/office/word/2010/wordprocessingShape" mc:Ignorable="w14 w15 w16se w16cid w16 w16cex w16sdtdh wp14">
+<w:ftr xmlns:wpc="http://schemas.microsoft.com/office/word/2010/wordprocessingCanvas" xmlns:cx="http://schemas.microsoft.com/office/drawing/2014/chartex" xmlns:cx1="http://schemas.microsoft.com/office/drawing/2015/9/8/chartex" xmlns:cx2="http://schemas.microsoft.com/office/drawing/2015/10/21/chartex" xmlns:cx3="http://schemas.microsoft.com/office/drawing/2016/5/9/chartex" xmlns:cx4="http://schemas.microsoft.com/office/drawing/2016/5/10/chartex" xmlns:cx5="http://schemas.microsoft.com/office/drawing/2016/5/11/chartex" xmlns:cx6="http://schemas.microsoft.com/office/drawing/2016/5/12/chartex" xmlns:cx7="http://schemas.microsoft.com/office/drawing/2016/5/13/chartex" xmlns:cx8="http://schemas.microsoft.com/office/drawing/2016/5/14/chartex" xmlns:mc="http://schemas.openxmlformats.org/markup-compatibility/2006" xmlns:aink="http://schemas.microsoft.com/office/drawing/2016/ink" xmlns:am3d="http://schemas.microsoft.com/office/drawing/2017/model3d" xmlns:o="urn:schemas-microsoft-com:office:office" xmlns:oel="http://schemas.microsoft.com/office/2019/extlst" xmlns:r="http://schemas.openxmlformats.org/officeDocument/2006/relationships" xmlns:m="http://schemas.openxmlformats.org/officeDocument/2006/math" xmlns:v="urn:schemas-microsoft-com:vml" xmlns:wp14="http://schemas.microsoft.com/office/word/2010/wordprocessingDrawing" xmlns:wp="http://schemas.openxmlformats.org/drawingml/2006/wordprocessingDrawing" xmlns:w10="urn:schemas-microsoft-com:office:word" xmlns:w="http://schemas.openxmlformats.org/wordprocessingml/2006/main" xmlns:w14="http://schemas.microsoft.com/office/word/2010/wordml" xmlns:w15="http://schemas.microsoft.com/office/word/2012/wordml" xmlns:w16cex="http://schemas.microsoft.com/office/word/2018/wordml/cex" xmlns:w16cid="http://schemas.microsoft.com/office/word/2016/wordml/cid" xmlns:w16="http://schemas.microsoft.com/office/word/2018/wordml" xmlns:w16du="http://schemas.microsoft.com/office/word/2023/wordml/word16du" xmlns:w16sdtdh="http://schemas.microsoft.com/office/word/2020/wordml/sdtdatahash" xmlns:w16sdtfl="http://schemas.microsoft.com/office/word/2024/wordml/sdtformatlock" xmlns:w16se="http://schemas.microsoft.com/office/word/2015/wordml/symex" xmlns:wpg="http://schemas.microsoft.com/office/word/2010/wordprocessingGroup" xmlns:wpi="http://schemas.microsoft.com/office/word/2010/wordprocessingInk" xmlns:wne="http://schemas.microsoft.com/office/word/2006/wordml" xmlns:wps="http://schemas.microsoft.com/office/word/2010/wordprocessingShape" mc:Ignorable="w14 w15 w16se w16cid w16 w16cex w16sdtdh w16sdtfl w16du wp14">
   <w:p>
     <w:pPr>
       <w:pBdr>
@@ -4459,7 +4233,7 @@
 </file>
 
 <file path=word/footnotes.xml><?xml version="1.0" encoding="utf-8"?>
-<w:footnotes xmlns:wpc="http://schemas.microsoft.com/office/word/2010/wordprocessingCanvas" xmlns:cx="http://schemas.microsoft.com/office/drawing/2014/chartex" xmlns:cx1="http://schemas.microsoft.com/office/drawing/2015/9/8/chartex" xmlns:cx2="http://schemas.microsoft.com/office/drawing/2015/10/21/chartex" xmlns:cx3="http://schemas.microsoft.com/office/drawing/2016/5/9/chartex" xmlns:cx4="http://schemas.microsoft.com/office/drawing/2016/5/10/chartex" xmlns:cx5="http://schemas.microsoft.com/office/drawing/2016/5/11/chartex" xmlns:cx6="http://schemas.microsoft.com/office/drawing/2016/5/12/chartex" xmlns:cx7="http://schemas.microsoft.com/office/drawing/2016/5/13/chartex" xmlns:cx8="http://schemas.microsoft.com/office/drawing/2016/5/14/chartex" xmlns:mc="http://schemas.openxmlformats.org/markup-compatibility/2006" xmlns:aink="http://schemas.microsoft.com/office/drawing/2016/ink" xmlns:am3d="http://schemas.microsoft.com/office/drawing/2017/model3d" xmlns:o="urn:schemas-microsoft-com:office:office" xmlns:oel="http://schemas.microsoft.com/office/2019/extlst" xmlns:r="http://schemas.openxmlformats.org/officeDocument/2006/relationships" xmlns:m="http://schemas.openxmlformats.org/officeDocument/2006/math" xmlns:v="urn:schemas-microsoft-com:vml" xmlns:wp14="http://schemas.microsoft.com/office/word/2010/wordprocessingDrawing" xmlns:wp="http://schemas.openxmlformats.org/drawingml/2006/wordprocessingDrawing" xmlns:w10="urn:schemas-microsoft-com:office:word" xmlns:w="http://schemas.openxmlformats.org/wordprocessingml/2006/main" xmlns:w14="http://schemas.microsoft.com/office/word/2010/wordml" xmlns:w15="http://schemas.microsoft.com/office/word/2012/wordml" xmlns:w16cex="http://schemas.microsoft.com/office/word/2018/wordml/cex" xmlns:w16cid="http://schemas.microsoft.com/office/word/2016/wordml/cid" xmlns:w16="http://schemas.microsoft.com/office/word/2018/wordml" xmlns:w16sdtdh="http://schemas.microsoft.com/office/word/2020/wordml/sdtdatahash" xmlns:w16se="http://schemas.microsoft.com/office/word/2015/wordml/symex" xmlns:wpg="http://schemas.microsoft.com/office/word/2010/wordprocessingGroup" xmlns:wpi="http://schemas.microsoft.com/office/word/2010/wordprocessingInk" xmlns:wne="http://schemas.microsoft.com/office/word/2006/wordml" xmlns:wps="http://schemas.microsoft.com/office/word/2010/wordprocessingShape" mc:Ignorable="w14 w15 w16se w16cid w16 w16cex w16sdtdh wp14">
+<w:footnotes xmlns:wpc="http://schemas.microsoft.com/office/word/2010/wordprocessingCanvas" xmlns:cx="http://schemas.microsoft.com/office/drawing/2014/chartex" xmlns:cx1="http://schemas.microsoft.com/office/drawing/2015/9/8/chartex" xmlns:cx2="http://schemas.microsoft.com/office/drawing/2015/10/21/chartex" xmlns:cx3="http://schemas.microsoft.com/office/drawing/2016/5/9/chartex" xmlns:cx4="http://schemas.microsoft.com/office/drawing/2016/5/10/chartex" xmlns:cx5="http://schemas.microsoft.com/office/drawing/2016/5/11/chartex" xmlns:cx6="http://schemas.microsoft.com/office/drawing/2016/5/12/chartex" xmlns:cx7="http://schemas.microsoft.com/office/drawing/2016/5/13/chartex" xmlns:cx8="http://schemas.microsoft.com/office/drawing/2016/5/14/chartex" xmlns:mc="http://schemas.openxmlformats.org/markup-compatibility/2006" xmlns:aink="http://schemas.microsoft.com/office/drawing/2016/ink" xmlns:am3d="http://schemas.microsoft.com/office/drawing/2017/model3d" xmlns:o="urn:schemas-microsoft-com:office:office" xmlns:oel="http://schemas.microsoft.com/office/2019/extlst" xmlns:r="http://schemas.openxmlformats.org/officeDocument/2006/relationships" xmlns:m="http://schemas.openxmlformats.org/officeDocument/2006/math" xmlns:v="urn:schemas-microsoft-com:vml" xmlns:wp14="http://schemas.microsoft.com/office/word/2010/wordprocessingDrawing" xmlns:wp="http://schemas.openxmlformats.org/drawingml/2006/wordprocessingDrawing" xmlns:w10="urn:schemas-microsoft-com:office:word" xmlns:w="http://schemas.openxmlformats.org/wordprocessingml/2006/main" xmlns:w14="http://schemas.microsoft.com/office/word/2010/wordml" xmlns:w15="http://schemas.microsoft.com/office/word/2012/wordml" xmlns:w16cex="http://schemas.microsoft.com/office/word/2018/wordml/cex" xmlns:w16cid="http://schemas.microsoft.com/office/word/2016/wordml/cid" xmlns:w16="http://schemas.microsoft.com/office/word/2018/wordml" xmlns:w16du="http://schemas.microsoft.com/office/word/2023/wordml/word16du" xmlns:w16sdtdh="http://schemas.microsoft.com/office/word/2020/wordml/sdtdatahash" xmlns:w16sdtfl="http://schemas.microsoft.com/office/word/2024/wordml/sdtformatlock" xmlns:w16se="http://schemas.microsoft.com/office/word/2015/wordml/symex" xmlns:wpg="http://schemas.microsoft.com/office/word/2010/wordprocessingGroup" xmlns:wpi="http://schemas.microsoft.com/office/word/2010/wordprocessingInk" xmlns:wne="http://schemas.microsoft.com/office/word/2006/wordml" xmlns:wps="http://schemas.microsoft.com/office/word/2010/wordprocessingShape" mc:Ignorable="w14 w15 w16se w16cid w16 w16cex w16sdtdh w16sdtfl w16du wp14">
   <w:footnote w:type="separator" w:id="-1">
     <w:p>
       <w:r>
@@ -4478,7 +4252,7 @@
 </file>
 
 <file path=word/numbering.xml><?xml version="1.0" encoding="utf-8"?>
-<w:numbering xmlns:wpc="http://schemas.microsoft.com/office/word/2010/wordprocessingCanvas" xmlns:cx="http://schemas.microsoft.com/office/drawing/2014/chartex" xmlns:cx1="http://schemas.microsoft.com/office/drawing/2015/9/8/chartex" xmlns:cx2="http://schemas.microsoft.com/office/drawing/2015/10/21/chartex" xmlns:cx3="http://schemas.microsoft.com/office/drawing/2016/5/9/chartex" xmlns:cx4="http://schemas.microsoft.com/office/drawing/2016/5/10/chartex" xmlns:cx5="http://schemas.microsoft.com/office/drawing/2016/5/11/chartex" xmlns:cx6="http://schemas.microsoft.com/office/drawing/2016/5/12/chartex" xmlns:cx7="http://schemas.microsoft.com/office/drawing/2016/5/13/chartex" xmlns:cx8="http://schemas.microsoft.com/office/drawing/2016/5/14/chartex" xmlns:mc="http://schemas.openxmlformats.org/markup-compatibility/2006" xmlns:aink="http://schemas.microsoft.com/office/drawing/2016/ink" xmlns:am3d="http://schemas.microsoft.com/office/drawing/2017/model3d" xmlns:o="urn:schemas-microsoft-com:office:office" xmlns:oel="http://schemas.microsoft.com/office/2019/extlst" xmlns:r="http://schemas.openxmlformats.org/officeDocument/2006/relationships" xmlns:m="http://schemas.openxmlformats.org/officeDocument/2006/math" xmlns:v="urn:schemas-microsoft-com:vml" xmlns:wp14="http://schemas.microsoft.com/office/word/2010/wordprocessingDrawing" xmlns:wp="http://schemas.openxmlformats.org/drawingml/2006/wordprocessingDrawing" xmlns:w10="urn:schemas-microsoft-com:office:word" xmlns:w="http://schemas.openxmlformats.org/wordprocessingml/2006/main" xmlns:w14="http://schemas.microsoft.com/office/word/2010/wordml" xmlns:w15="http://schemas.microsoft.com/office/word/2012/wordml" xmlns:w16cex="http://schemas.microsoft.com/office/word/2018/wordml/cex" xmlns:w16cid="http://schemas.microsoft.com/office/word/2016/wordml/cid" xmlns:w16="http://schemas.microsoft.com/office/word/2018/wordml" xmlns:w16sdtdh="http://schemas.microsoft.com/office/word/2020/wordml/sdtdatahash" xmlns:w16se="http://schemas.microsoft.com/office/word/2015/wordml/symex" xmlns:wpg="http://schemas.microsoft.com/office/word/2010/wordprocessingGroup" xmlns:wpi="http://schemas.microsoft.com/office/word/2010/wordprocessingInk" xmlns:wne="http://schemas.microsoft.com/office/word/2006/wordml" xmlns:wps="http://schemas.microsoft.com/office/word/2010/wordprocessingShape" mc:Ignorable="w14 w15 w16se w16cid w16 w16cex w16sdtdh wp14">
+<w:numbering xmlns:wpc="http://schemas.microsoft.com/office/word/2010/wordprocessingCanvas" xmlns:cx="http://schemas.microsoft.com/office/drawing/2014/chartex" xmlns:cx1="http://schemas.microsoft.com/office/drawing/2015/9/8/chartex" xmlns:cx2="http://schemas.microsoft.com/office/drawing/2015/10/21/chartex" xmlns:cx3="http://schemas.microsoft.com/office/drawing/2016/5/9/chartex" xmlns:cx4="http://schemas.microsoft.com/office/drawing/2016/5/10/chartex" xmlns:cx5="http://schemas.microsoft.com/office/drawing/2016/5/11/chartex" xmlns:cx6="http://schemas.microsoft.com/office/drawing/2016/5/12/chartex" xmlns:cx7="http://schemas.microsoft.com/office/drawing/2016/5/13/chartex" xmlns:cx8="http://schemas.microsoft.com/office/drawing/2016/5/14/chartex" xmlns:mc="http://schemas.openxmlformats.org/markup-compatibility/2006" xmlns:aink="http://schemas.microsoft.com/office/drawing/2016/ink" xmlns:am3d="http://schemas.microsoft.com/office/drawing/2017/model3d" xmlns:o="urn:schemas-microsoft-com:office:office" xmlns:oel="http://schemas.microsoft.com/office/2019/extlst" xmlns:r="http://schemas.openxmlformats.org/officeDocument/2006/relationships" xmlns:m="http://schemas.openxmlformats.org/officeDocument/2006/math" xmlns:v="urn:schemas-microsoft-com:vml" xmlns:wp14="http://schemas.microsoft.com/office/word/2010/wordprocessingDrawing" xmlns:wp="http://schemas.openxmlformats.org/drawingml/2006/wordprocessingDrawing" xmlns:w10="urn:schemas-microsoft-com:office:word" xmlns:w="http://schemas.openxmlformats.org/wordprocessingml/2006/main" xmlns:w14="http://schemas.microsoft.com/office/word/2010/wordml" xmlns:w15="http://schemas.microsoft.com/office/word/2012/wordml" xmlns:w16cex="http://schemas.microsoft.com/office/word/2018/wordml/cex" xmlns:w16cid="http://schemas.microsoft.com/office/word/2016/wordml/cid" xmlns:w16="http://schemas.microsoft.com/office/word/2018/wordml" xmlns:w16du="http://schemas.microsoft.com/office/word/2023/wordml/word16du" xmlns:w16sdtdh="http://schemas.microsoft.com/office/word/2020/wordml/sdtdatahash" xmlns:w16sdtfl="http://schemas.microsoft.com/office/word/2024/wordml/sdtformatlock" xmlns:w16se="http://schemas.microsoft.com/office/word/2015/wordml/symex" xmlns:wpg="http://schemas.microsoft.com/office/word/2010/wordprocessingGroup" xmlns:wpi="http://schemas.microsoft.com/office/word/2010/wordprocessingInk" xmlns:wne="http://schemas.microsoft.com/office/word/2006/wordml" xmlns:wps="http://schemas.microsoft.com/office/word/2010/wordprocessingShape" mc:Ignorable="w14 w15 w16se w16cid w16 w16cex w16sdtdh w16sdtfl w16du wp14">
   <w:abstractNum w:abstractNumId="0" w15:restartNumberingAfterBreak="0">
     <w:nsid w:val="0C7F18FC"/>
     <w:multiLevelType w:val="multilevel"/>
@@ -5877,7 +5651,7 @@
 </file>
 
 <file path=word/styles.xml><?xml version="1.0" encoding="utf-8"?>
-<w:styles xmlns:mc="http://schemas.openxmlformats.org/markup-compatibility/2006" xmlns:r="http://schemas.openxmlformats.org/officeDocument/2006/relationships" xmlns:w="http://schemas.openxmlformats.org/wordprocessingml/2006/main" xmlns:w14="http://schemas.microsoft.com/office/word/2010/wordml" xmlns:w15="http://schemas.microsoft.com/office/word/2012/wordml" xmlns:w16cex="http://schemas.microsoft.com/office/word/2018/wordml/cex" xmlns:w16cid="http://schemas.microsoft.com/office/word/2016/wordml/cid" xmlns:w16="http://schemas.microsoft.com/office/word/2018/wordml" xmlns:w16sdtdh="http://schemas.microsoft.com/office/word/2020/wordml/sdtdatahash" xmlns:w16se="http://schemas.microsoft.com/office/word/2015/wordml/symex" mc:Ignorable="w14 w15 w16se w16cid w16 w16cex w16sdtdh">
+<w:styles xmlns:mc="http://schemas.openxmlformats.org/markup-compatibility/2006" xmlns:r="http://schemas.openxmlformats.org/officeDocument/2006/relationships" xmlns:w="http://schemas.openxmlformats.org/wordprocessingml/2006/main" xmlns:w14="http://schemas.microsoft.com/office/word/2010/wordml" xmlns:w15="http://schemas.microsoft.com/office/word/2012/wordml" xmlns:w16cex="http://schemas.microsoft.com/office/word/2018/wordml/cex" xmlns:w16cid="http://schemas.microsoft.com/office/word/2016/wordml/cid" xmlns:w16="http://schemas.microsoft.com/office/word/2018/wordml" xmlns:w16du="http://schemas.microsoft.com/office/word/2023/wordml/word16du" xmlns:w16sdtdh="http://schemas.microsoft.com/office/word/2020/wordml/sdtdatahash" xmlns:w16sdtfl="http://schemas.microsoft.com/office/word/2024/wordml/sdtformatlock" xmlns:w16se="http://schemas.microsoft.com/office/word/2015/wordml/symex" mc:Ignorable="w14 w15 w16se w16cid w16 w16cex w16sdtdh w16sdtfl w16du">
   <w:docDefaults>
     <w:rPrDefault>
       <w:rPr>

</xml_diff>